<commit_message>
feat: structured office address fields — certification letterhead goes dynamic
Offices gain agency/city/province/postal fields (editable on the office
form), and profile() composes company_agency, company_city_line
("City, Province") and company_postal_line ("Postal, Philippines") from
them. The Certification letterhead now merges all four lines from the
intern host office instead of hardcoding the MIS office address.
The MIS office row carries its real values. 332 tests passing.
</commit_message>
<xml_diff>
--- a/public/documents/templates/cas/certification-template.docx
+++ b/public/documents/templates/cas/certification-template.docx
@@ -19,23 +19,23 @@
           <w:sz w:val="24"/>
           <w:szCs w:val="24"/>
         </w:rPr>
-        <w:t xml:space="preserve">NORSU-BSC </w:t>
-      </w:r>
-      <w:r>
-        <w:rPr>
-          <w:rFonts w:ascii="Arial Narrow" w:hAnsi="Arial Narrow"/>
-          <w:sz w:val="24"/>
-          <w:szCs w:val="24"/>
-        </w:rPr>
-        <w:t>MIS</w:t>
-      </w:r>
-      <w:r>
-        <w:rPr>
-          <w:rFonts w:ascii="Arial Narrow" w:hAnsi="Arial Narrow"/>
-          <w:sz w:val="24"/>
-          <w:szCs w:val="24"/>
-        </w:rPr>
-        <w:t xml:space="preserve"> OFFICE</w:t>
+        <w:t xml:space="preserve">${company_name}</w:t>
+      </w:r>
+      <w:r>
+        <w:rPr>
+          <w:rFonts w:ascii="Arial Narrow" w:hAnsi="Arial Narrow"/>
+          <w:sz w:val="24"/>
+          <w:szCs w:val="24"/>
+        </w:rPr>
+        <w:t/>
+      </w:r>
+      <w:r>
+        <w:rPr>
+          <w:rFonts w:ascii="Arial Narrow" w:hAnsi="Arial Narrow"/>
+          <w:sz w:val="24"/>
+          <w:szCs w:val="24"/>
+        </w:rPr>
+        <w:t xml:space="preserve"/>
       </w:r>
     </w:p>
     <w:p>
@@ -55,7 +55,7 @@
           <w:sz w:val="24"/>
           <w:szCs w:val="24"/>
         </w:rPr>
-        <w:t>Negros Oriental State University - BSC</w:t>
+        <w:t>${company_agency}</w:t>
       </w:r>
     </w:p>
     <w:p>
@@ -76,7 +76,7 @@
           <w:sz w:val="24"/>
           <w:szCs w:val="24"/>
         </w:rPr>
-        <w:t>Bayawan</w:t>
+        <w:t>${company_city_line}</w:t>
       </w:r>
       <w:proofErr w:type="spellEnd"/>
       <w:r>
@@ -85,7 +85,7 @@
           <w:sz w:val="24"/>
           <w:szCs w:val="24"/>
         </w:rPr>
-        <w:t xml:space="preserve"> City, Negros Oriental</w:t>
+        <w:t xml:space="preserve"/>
       </w:r>
     </w:p>
     <w:p>
@@ -106,7 +106,7 @@
           <w:sz w:val="24"/>
           <w:szCs w:val="24"/>
         </w:rPr>
-        <w:t>6221 Philippines</w:t>
+        <w:t>${company_postal_line}</w:t>
       </w:r>
     </w:p>
     <w:p>

</xml_diff>